<commit_message>
laneA2(F0L): PLI_M04 — mục 13 CSHHL theo Mẫu số 10, GCNĐKĐT mục 9, '1.6'->'11.6' (bản in 2026 p39), Phụ lục CAM KẾT biến thể cổ đông (p41); test_m0304_tails cập nhật cấu trúc hiện luật (CSHL statement, da_sua_so, allowlist 4 chk_gt_*)
</commit_message>
<xml_diff>
--- a/06_ho_kinh_doanh_va_chuyen_doi/02_chuyen_doi_hkd_sang_dn/PL1_Mau_04_tach_tu_file_full.docx
+++ b/06_ho_kinh_doanh_va_chuyen_doi/02_chuyen_doi_hkd_sang_dn/PL1_Mau_04_tach_tu_file_full.docx
@@ -945,50 +945,33 @@
           <w:sz w:val="24"/>
           <w:sz-cs w:val="24"/>
         </w:rPr>
-        <w:t xml:space="preserve">Số Giấy chứng nhận đăng ký hộ kinh doanh (</w:t>
-      </w:r>
-      <w:r>
-        <w:rPr>
-          <w:rFonts w:ascii="Arial" w:hAnsi="Arial" w:cs="Arial"/>
-          <w:sz w:val="24"/>
-          <w:sz-cs w:val="24"/>
-          <w:i/>
-        </w:rPr>
-        <w:t xml:space="preserve">nếu có</w:t>
-      </w:r>
-      <w:r>
-        <w:rPr>
-          <w:rFonts w:ascii="Arial" w:hAnsi="Arial" w:cs="Arial"/>
-          <w:sz w:val="24"/>
-          <w:sz-cs w:val="24"/>
-        </w:rPr>
-        <w:t xml:space="preserve">): …………………………</w:t>
-      </w:r>
-    </w:p>
-    <w:p>
-      <w:pPr>
-        <w:spacing w:before="120"/>
-      </w:pPr>
-      <w:r>
-        <w:rPr>
-          <w:rFonts w:ascii="Arial" w:hAnsi="Arial" w:cs="Arial"/>
-          <w:sz w:val="24"/>
-          <w:sz-cs w:val="24"/>
-        </w:rPr>
-        <w:t xml:space="preserve">Ngày cấp: ………../……../…….. Nơi cấp: ……………………………………….</w:t>
-      </w:r>
-    </w:p>
-    <w:p>
-      <w:pPr>
-        <w:spacing w:before="120"/>
-      </w:pPr>
-      <w:r>
-        <w:rPr>
-          <w:rFonts w:ascii="Arial" w:hAnsi="Arial" w:cs="Arial"/>
-          <w:sz w:val="24"/>
-          <w:sz-cs w:val="24"/>
-        </w:rPr>
-        <w:t xml:space="preserve">Mã số thuế của hộ kinh doanh: …………………………………………………..</w:t>
+        <w:t>Mã số hộ kinh doanh/Mã số đăng ký hộ kinh doanh/Mã số thuế: ……………………………………</w:t>
+      </w:r>
+      <w:r>
+        <w:rPr>
+          <w:rFonts w:ascii="Arial" w:hAnsi="Arial" w:cs="Arial"/>
+          <w:sz w:val="24"/>
+          <w:sz-cs w:val="24"/>
+          <w:i/>
+        </w:rPr>
+      </w:r>
+      <w:r>
+        <w:rPr>
+          <w:rFonts w:ascii="Arial" w:hAnsi="Arial" w:cs="Arial"/>
+          <w:sz w:val="24"/>
+          <w:sz-cs w:val="24"/>
+        </w:rPr>
+      </w:r>
+    </w:p>
+    <w:p>
+      <w:pPr>
+        <w:spacing w:before="120"/>
+      </w:pPr>
+      <w:r>
+        <w:rPr>
+          <w:i/>
+        </w:rPr>
+        <w:t>Trường hợp không khai thác được thông tin về hộ kinh doanh được chuyển đổi từ Cơ sở dữ liệu về đăng ký hộ kinh doanh hoặc thông tin khai thác được về hộ kinh doanh được chuyển đổi từ Cơ sở dữ liệu về đăng ký hộ kinh doanh không đầy đủ, không chính xác thì kê khai thêm các nội dung sau:</w:t>
       </w:r>
     </w:p>
     <w:p>
@@ -1570,33 +1553,30 @@
           <w:sz w:val="24"/>
           <w:sz-cs w:val="24"/>
         </w:rPr>
-        <w:t xml:space="preserve">Giấy phép thành lập và hoạt động số: … do Ủy ban Chứng khoán Nhà nước cấp ngày: …./…./….. (</w:t>
-      </w:r>
-      <w:r>
-        <w:rPr>
-          <w:rFonts w:ascii="Arial" w:hAnsi="Arial" w:cs="Arial"/>
-          <w:sz w:val="24"/>
-          <w:sz-cs w:val="24"/>
-          <w:i/>
-        </w:rPr>
-        <w:t xml:space="preserve">nếu có</w:t>
-      </w:r>
-      <w:r>
-        <w:rPr>
-          <w:rFonts w:ascii="Arial" w:hAnsi="Arial" w:cs="Arial"/>
-          <w:sz w:val="24"/>
-          <w:sz-cs w:val="24"/>
-        </w:rPr>
-        <w:t xml:space="preserve">)</w:t>
-      </w:r>
-      <w:r>
-        <w:rPr>
-          <w:rFonts w:ascii="Arial" w:hAnsi="Arial" w:cs="Arial"/>
-          <w:sz w:val="24"/>
-          <w:sz-cs w:val="24"/>
-          <w:b/>
-        </w:rPr>
-        <w:t xml:space="preserve"/>
+        <w:t>Giấy phép thành lập và hoạt động số: … do Uỷ ban Chứng khoán Nhà nước cấp ngày: …./…./….. (nếu có)</w:t>
+      </w:r>
+      <w:r>
+        <w:rPr>
+          <w:rFonts w:ascii="Arial" w:hAnsi="Arial" w:cs="Arial"/>
+          <w:sz w:val="24"/>
+          <w:sz-cs w:val="24"/>
+          <w:i/>
+        </w:rPr>
+      </w:r>
+      <w:r>
+        <w:rPr>
+          <w:rFonts w:ascii="Arial" w:hAnsi="Arial" w:cs="Arial"/>
+          <w:sz w:val="24"/>
+          <w:sz-cs w:val="24"/>
+        </w:rPr>
+      </w:r>
+      <w:r>
+        <w:rPr>
+          <w:rFonts w:ascii="Arial" w:hAnsi="Arial" w:cs="Arial"/>
+          <w:sz w:val="24"/>
+          <w:sz-cs w:val="24"/>
+          <w:b/>
+        </w:rPr>
       </w:r>
     </w:p>
     <w:p>
@@ -3599,24 +3579,22 @@
           <w:sz w:val="24"/>
           <w:sz-cs w:val="24"/>
         </w:rPr>
-        <w:t xml:space="preserve">- Thông tin về Giấy chứng nhận đăng ký đầu tư (</w:t>
-      </w:r>
-      <w:r>
-        <w:rPr>
-          <w:rFonts w:ascii="Arial" w:hAnsi="Arial" w:cs="Arial"/>
-          <w:sz w:val="24"/>
-          <w:sz-cs w:val="24"/>
-          <w:i/>
-        </w:rPr>
-        <w:t xml:space="preserve">kê khai trong trường hợp cổ đông là nhà đầu tư nước ngoài được cấp Giấy chứng nhận đăng ký đầu tư theo quy định của Luật Đầu tư</w:t>
-      </w:r>
-      <w:r>
-        <w:rPr>
-          <w:rFonts w:ascii="Arial" w:hAnsi="Arial" w:cs="Arial"/>
-          <w:sz w:val="24"/>
-          <w:sz-cs w:val="24"/>
-        </w:rPr>
-        <w:t xml:space="preserve">):</w:t>
+        <w:t>- Thông tin về Giấy chứng nhận đăng ký đầu tư (chỉ kê khai nếu cổ đông là nhà đầu tư nước ngoài được cấp Giấy chứng nhận đăng ký đầu tư theo quy định của pháp luật – nếu có):</w:t>
+      </w:r>
+      <w:r>
+        <w:rPr>
+          <w:rFonts w:ascii="Arial" w:hAnsi="Arial" w:cs="Arial"/>
+          <w:sz w:val="24"/>
+          <w:sz-cs w:val="24"/>
+          <w:i/>
+        </w:rPr>
+      </w:r>
+      <w:r>
+        <w:rPr>
+          <w:rFonts w:ascii="Arial" w:hAnsi="Arial" w:cs="Arial"/>
+          <w:sz w:val="24"/>
+          <w:sz-cs w:val="24"/>
+        </w:rPr>
       </w:r>
     </w:p>
     <w:p>
@@ -4716,7 +4694,7 @@
           <w:sz w:val="24"/>
           <w:sz-cs w:val="24"/>
         </w:rPr>
-        <w:t xml:space="preserve">1.6</w:t>
+        <w:t>11.6</w:t>
       </w:r>
     </w:p>
     <w:p>
@@ -5307,7 +5285,7 @@
           <w:sz-cs w:val="24"/>
           <w:b/>
         </w:rPr>
-        <w:t xml:space="preserve">13. Thông tin về chủ sở hữu hưởng lợi của doanh nghiệp</w:t>
+        <w:t>13. Thông tin về chủ sở hữu hưởng lợi của doanh nghiệp:</w:t>
       </w:r>
       <w:r>
         <w:rPr>
@@ -5316,63 +5294,34 @@
           <w:sz-cs w:val="24"/>
           <w:vertAlign w:val="superscript"/>
         </w:rPr>
-        <w:t xml:space="preserve">10</w:t>
-      </w:r>
-      <w:r>
-        <w:rPr>
-          <w:rFonts w:ascii="Arial" w:hAnsi="Arial" w:cs="Arial"/>
-          <w:sz w:val="24"/>
-          <w:sz-cs w:val="24"/>
-          <w:b/>
-        </w:rPr>
-        <w:t xml:space="preserve">:</w:t>
-      </w:r>
-      <w:r>
-        <w:rPr>
-          <w:rFonts w:ascii="Arial" w:hAnsi="Arial" w:cs="Arial"/>
-          <w:sz w:val="24"/>
-          <w:sz-cs w:val="24"/>
-        </w:rPr>
-        <w:t xml:space="preserve"/>
-      </w:r>
-    </w:p>
-    <w:p>
-      <w:pPr>
-        <w:spacing w:before="120"/>
-      </w:pPr>
-      <w:r>
-        <w:rPr>
-          <w:rFonts w:ascii="Arial" w:hAnsi="Arial" w:cs="Arial"/>
-          <w:sz w:val="24"/>
-          <w:sz-cs w:val="24"/>
-        </w:rPr>
-        <w:t xml:space="preserve">Doanh nghiệp có chủ sở hữu hưởng lợi không?</w:t>
-      </w:r>
-    </w:p>
-    <w:p>
-      <w:pPr>
-        <w:spacing w:before="120"/>
-      </w:pPr>
-      <w:r>
-        <w:rPr>
-          <w:rFonts w:ascii="Arial" w:hAnsi="Arial" w:cs="Arial"/>
-          <w:sz w:val="24"/>
-          <w:sz-cs w:val="24"/>
-        </w:rPr>
-        <w:t xml:space="preserve">□ Có</w:t>
-      </w:r>
-    </w:p>
-    <w:p>
-      <w:pPr>
-        <w:spacing w:before="120"/>
-      </w:pPr>
-      <w:r>
-        <w:rPr>
-          <w:rFonts w:ascii="Arial" w:hAnsi="Arial" w:cs="Arial"/>
-          <w:sz w:val="24"/>
-          <w:sz-cs w:val="24"/>
-        </w:rPr>
-        <w:t xml:space="preserve"> □ Không</w:t>
+      </w:r>
+      <w:r>
+        <w:rPr>
+          <w:rFonts w:ascii="Arial" w:hAnsi="Arial" w:cs="Arial"/>
+          <w:sz w:val="24"/>
+          <w:sz-cs w:val="24"/>
+          <w:b/>
+        </w:rPr>
+      </w:r>
+      <w:r>
+        <w:rPr>
+          <w:rFonts w:ascii="Arial" w:hAnsi="Arial" w:cs="Arial"/>
+          <w:sz w:val="24"/>
+          <w:sz-cs w:val="24"/>
+        </w:rPr>
+      </w:r>
+    </w:p>
+    <w:p>
+      <w:pPr>
+        <w:spacing w:before="120"/>
+      </w:pPr>
+      <w:r>
+        <w:rPr>
+          <w:rFonts w:ascii="Arial" w:hAnsi="Arial" w:cs="Arial"/>
+          <w:sz w:val="24"/>
+          <w:sz-cs w:val="24"/>
+        </w:rPr>
+        <w:t>Doanh nghiệp kê khai thông tin về chủ sở hữu hưởng lợi của doanh nghiệp theo Mẫu số 10 ban hành kèm theo Thông tư này.</w:t>
       </w:r>
     </w:p>
     <w:p>
@@ -5386,6 +5335,14 @@
           <w:sz-cs w:val="24"/>
         </w:rPr>
         <w:t xml:space="preserve">Trường hợp hồ sơ đăng ký doanh nghiệp hợp lệ, đề nghị Quý Cơ quan đăng công bố nội dung đăng ký doanh nghiệp trên Cổng thông tin quốc gia về đăng ký doanh nghiệp.</w:t>
+      </w:r>
+    </w:p>
+    <w:p>
+      <w:pPr>
+        <w:spacing w:before="120"/>
+      </w:pPr>
+      <w:r>
+        <w:t>Xin gửi kèm cam kết của nhà đầu tư nước ngoài theo quy định tại Điều 7 Nghị định số 296/2026/NĐ-CP ngày 23/7/2026 của Chính phủ sửa đổi, bổ sung một số điều của Nghị định số 168/2025/NĐ-CP ngày 30/6/2025 của Chính phủ về đăng ký doanh nghiệp tại Phụ lục kèm theo Giấy đề nghị này10.</w:t>
       </w:r>
     </w:p>
     <w:p>
@@ -5780,15 +5737,14 @@
           <w:sz-cs w:val="24"/>
           <w:vertAlign w:val="superscript"/>
         </w:rPr>
-        <w:t xml:space="preserve">10</w:t>
-      </w:r>
-      <w:r>
-        <w:rPr>
-          <w:rFonts w:ascii="Arial" w:hAnsi="Arial" w:cs="Arial"/>
-          <w:sz w:val="24"/>
-          <w:sz-cs w:val="24"/>
-        </w:rPr>
-        <w:t xml:space="preserve"> Trường hợp doanh nghiệp có thông tin về chủ sở hữu hưởng lợi của doanh nghiệp quy định tại khoản 1, khoản 2 Điều 18 Nghị định số 168/2025/NĐ-CP thì kê khai theo Mẫu số 10 Phụ lục I ban hành kèm theo Thông tư này.</w:t>
+        <w:t>10 Doanh nghiệp chỉ ghi nội dung này và gửi phụ lục kèm theo trong trường hợp doanh nghiệp là tổ chức kinh tế thực hiện dự án do nhà đầu tư nước ngoài thành lập trước khi thực hiện thủ tục cấp, điều chỉnh Giấy chứng nhận đăng ký đầu tư theo quy định của pháp luật về đầu tư.</w:t>
+      </w:r>
+      <w:r>
+        <w:rPr>
+          <w:rFonts w:ascii="Arial" w:hAnsi="Arial" w:cs="Arial"/>
+          <w:sz w:val="24"/>
+          <w:sz-cs w:val="24"/>
+        </w:rPr>
       </w:r>
     </w:p>
     <w:p>
@@ -5851,6 +5807,255 @@
           <w:sz-cs w:val="24"/>
         </w:rPr>
         <w:t xml:space="preserve"/>
+      </w:r>
+    </w:p>
+    <w:p>
+      <w:pPr>
+        <w:jc w:val="right"/>
+        <w:spacing w:before="120"/>
+      </w:pPr>
+      <w:r>
+        <w:t>Phụ lục</w:t>
+      </w:r>
+    </w:p>
+    <w:p>
+      <w:pPr>
+        <w:jc w:val="right"/>
+        <w:spacing w:before="120"/>
+      </w:pPr>
+      <w:r>
+        <w:rPr>
+          <w:i/>
+        </w:rPr>
+        <w:t>(Kèm theo Giấy đề nghị đăng ký doanh nghiệp …1)</w:t>
+      </w:r>
+    </w:p>
+    <w:p>
+      <w:pPr>
+        <w:jc w:val="right"/>
+        <w:spacing w:before="120"/>
+      </w:pPr>
+      <w:r>
+        <w:t>CỘNG HÒA XÃ HỘI CHỦ NGHĨA VIỆT NAM</w:t>
+      </w:r>
+    </w:p>
+    <w:p>
+      <w:pPr>
+        <w:jc w:val="right"/>
+        <w:spacing w:before="120"/>
+      </w:pPr>
+      <w:r>
+        <w:t>Độc lập - Tự do - Hạnh phúc</w:t>
+      </w:r>
+    </w:p>
+    <w:p>
+      <w:pPr>
+        <w:jc w:val="right"/>
+        <w:spacing w:before="120"/>
+      </w:pPr>
+      <w:r>
+        <w:rPr>
+          <w:i/>
+        </w:rPr>
+        <w:t>……, ngày …… tháng …… năm ……</w:t>
+      </w:r>
+    </w:p>
+    <w:p>
+      <w:pPr>
+        <w:jc w:val="right"/>
+        <w:spacing w:before="120"/>
+      </w:pPr>
+      <w:r>
+        <w:t>CAM KẾT</w:t>
+      </w:r>
+    </w:p>
+    <w:p>
+      <w:pPr>
+        <w:jc w:val="right"/>
+        <w:spacing w:before="120"/>
+      </w:pPr>
+      <w:r>
+        <w:t>Về việc đáp ứng điều kiện tiếp cận thị trường đối với nhà đầu tư nước ngoài</w:t>
+      </w:r>
+    </w:p>
+    <w:p>
+      <w:pPr>
+        <w:jc w:val="right"/>
+        <w:spacing w:before="120"/>
+      </w:pPr>
+      <w:r>
+        <w:t>theo quy định của pháp luật</w:t>
+      </w:r>
+    </w:p>
+    <w:p>
+      <w:pPr>
+        <w:jc w:val="right"/>
+        <w:spacing w:before="120"/>
+      </w:pPr>
+      <w:r>
+        <w:t>Kính gửi: (Cơ quan đăng ký kinh doanh cấp tỉnh) ………………….</w:t>
+      </w:r>
+    </w:p>
+    <w:p>
+      <w:pPr>
+        <w:jc w:val="right"/>
+        <w:spacing w:before="120"/>
+      </w:pPr>
+      <w:r>
+        <w:t>Nhà đầu tư nước ngoài có thông tin dưới đây:</w:t>
+      </w:r>
+    </w:p>
+    <w:p>
+      <w:pPr>
+        <w:jc w:val="right"/>
+        <w:spacing w:before="120"/>
+      </w:pPr>
+      <w:r>
+        <w:rPr>
+          <w:i/>
+        </w:rPr>
+        <w:t>(Trường hợp cổ đông là cá nhân thì kê khai:)</w:t>
+      </w:r>
+    </w:p>
+    <w:p>
+      <w:pPr>
+        <w:jc w:val="right"/>
+        <w:spacing w:before="120"/>
+      </w:pPr>
+      <w:r>
+        <w:t>1. Họ, chữ đệm và tên (ghi bằng chữ in hoa): …………………………………….</w:t>
+      </w:r>
+    </w:p>
+    <w:p>
+      <w:pPr>
+        <w:jc w:val="right"/>
+        <w:spacing w:before="120"/>
+      </w:pPr>
+      <w:r>
+        <w:t>Số định danh cá nhân: … / Số Hộ chiếu nước ngoài hoặc giấy tờ có giá trị thay thế Hộ chiếu nước ngoài: … Ngày cấp: … Nơi cấp: …</w:t>
+      </w:r>
+    </w:p>
+    <w:p>
+      <w:pPr>
+        <w:jc w:val="right"/>
+        <w:spacing w:before="120"/>
+      </w:pPr>
+      <w:r>
+        <w:rPr>
+          <w:i/>
+        </w:rPr>
+        <w:t>(Trường hợp cổ đông là tổ chức thì kê khai:)</w:t>
+      </w:r>
+    </w:p>
+    <w:p>
+      <w:pPr>
+        <w:jc w:val="right"/>
+        <w:spacing w:before="120"/>
+      </w:pPr>
+      <w:r>
+        <w:t>2. Họ, chữ đệm và tên (ghi bằng chữ in hoa): …………………………………….</w:t>
+      </w:r>
+    </w:p>
+    <w:p>
+      <w:pPr>
+        <w:jc w:val="right"/>
+        <w:spacing w:before="120"/>
+      </w:pPr>
+      <w:r>
+        <w:t>Tên tổ chức (ghi bằng chữ in hoa): ……………………………………………….</w:t>
+      </w:r>
+    </w:p>
+    <w:p>
+      <w:pPr>
+        <w:jc w:val="right"/>
+        <w:spacing w:before="120"/>
+      </w:pPr>
+      <w:r>
+        <w:t>Mã số doanh nghiệp/Số Quyết định thành lập: ………………………………….</w:t>
+      </w:r>
+    </w:p>
+    <w:p>
+      <w:pPr>
+        <w:jc w:val="right"/>
+        <w:spacing w:before="120"/>
+      </w:pPr>
+      <w:r>
+        <w:t>Người đại diện theo pháp luật (ghi bằng chữ in hoa): ……………………….</w:t>
+      </w:r>
+    </w:p>
+    <w:p>
+      <w:pPr>
+        <w:jc w:val="right"/>
+        <w:spacing w:before="120"/>
+      </w:pPr>
+      <w:r>
+        <w:t>Số định danh cá nhân: … / Số Hộ chiếu nước ngoài hoặc giấy tờ có giá trị thay thế Hộ chiếu nước ngoài: … Ngày cấp: … Nơi cấp: …</w:t>
+      </w:r>
+    </w:p>
+    <w:p>
+      <w:pPr>
+        <w:jc w:val="right"/>
+        <w:spacing w:before="120"/>
+      </w:pPr>
+      <w:r>
+        <w:t>3. …2</w:t>
+      </w:r>
+    </w:p>
+    <w:p>
+      <w:pPr>
+        <w:jc w:val="right"/>
+        <w:spacing w:before="120"/>
+      </w:pPr>
+      <w:r>
+        <w:t>Cam kết đáp ứng điều kiện tiếp cận thị trường đối với nhà đầu tư nước ngoài theo quy định của pháp luật khi thực hiện thủ tục thành lập ..3 và hoàn toàn chịu trách nhiệm trước pháp luật về tính hợp pháp, chính xác và trung thực của nội dung Cam kết này.</w:t>
+      </w:r>
+    </w:p>
+    <w:p>
+      <w:pPr>
+        <w:jc w:val="right"/>
+        <w:spacing w:before="120"/>
+      </w:pPr>
+      <w:r>
+        <w:t>NHÀ ĐẦU TƯ NƯỚC NGOÀI4</w:t>
+      </w:r>
+    </w:p>
+    <w:p>
+      <w:pPr>
+        <w:jc w:val="right"/>
+        <w:spacing w:before="120"/>
+      </w:pPr>
+      <w:r>
+        <w:rPr>
+          <w:i/>
+        </w:rPr>
+        <w:t>(Ký và ghi họ tên)</w:t>
+      </w:r>
+    </w:p>
+    <w:p>
+      <w:pPr>
+        <w:jc w:val="right"/>
+        <w:spacing w:before="120"/>
+      </w:pPr>
+      <w:r>
+        <w:t>1,3 Ghi tên doanh nghiệp dự kiến thành lập.</w:t>
+      </w:r>
+    </w:p>
+    <w:p>
+      <w:pPr>
+        <w:jc w:val="right"/>
+        <w:spacing w:before="120"/>
+      </w:pPr>
+      <w:r>
+        <w:t>2 Kê khai thông tin của tất cả nhà đầu tư nước ngoài.</w:t>
+      </w:r>
+    </w:p>
+    <w:p>
+      <w:pPr>
+        <w:jc w:val="right"/>
+        <w:spacing w:before="120"/>
+      </w:pPr>
+      <w:r>
+        <w:t>4 Tất cả nhà đầu tư nước ngoài là cá nhân hoặc người đại diện theo pháp luật của nhà đầu tư nước ngoài là tổ chức được kê khai tại cam kết ký trực tiếp vào phần này.</w:t>
       </w:r>
     </w:p>
     <w:sectPr>

</xml_diff>